<commit_message>
*UPDATE* info and rf docs
Co-Authored-By: Carolina Tavares <113713172+carolinatvs@users.noreply.github.com>
</commit_message>
<xml_diff>
--- a/docs/infoG12.docx
+++ b/docs/infoG12.docx
@@ -12,8 +12,91 @@
           <w:szCs w:val="32"/>
         </w:rPr>
       </w:pPr>
-      <w:proofErr w:type="spellStart"/>
-      <w:r>
+      <w:r>
+        <w:rPr>
+          <w:noProof/>
+        </w:rPr>
+        <w:drawing>
+          <wp:anchor distT="0" distB="0" distL="114300" distR="114300" simplePos="0" relativeHeight="251658240" behindDoc="1" locked="0" layoutInCell="1" allowOverlap="1" wp14:anchorId="42417AFD" wp14:editId="4290BA91">
+            <wp:simplePos x="0" y="0"/>
+            <wp:positionH relativeFrom="margin">
+              <wp:align>center</wp:align>
+            </wp:positionH>
+            <wp:positionV relativeFrom="paragraph">
+              <wp:posOffset>9525</wp:posOffset>
+            </wp:positionV>
+            <wp:extent cx="2828925" cy="1320165"/>
+            <wp:effectExtent l="0" t="0" r="0" b="0"/>
+            <wp:wrapTight wrapText="bothSides">
+              <wp:wrapPolygon edited="0">
+                <wp:start x="3055" y="6234"/>
+                <wp:lineTo x="3055" y="7792"/>
+                <wp:lineTo x="4655" y="11844"/>
+                <wp:lineTo x="3345" y="12779"/>
+                <wp:lineTo x="3055" y="13403"/>
+                <wp:lineTo x="3055" y="14961"/>
+                <wp:lineTo x="18618" y="14961"/>
+                <wp:lineTo x="18909" y="13403"/>
+                <wp:lineTo x="18182" y="12779"/>
+                <wp:lineTo x="15709" y="11844"/>
+                <wp:lineTo x="15709" y="6234"/>
+                <wp:lineTo x="3055" y="6234"/>
+              </wp:wrapPolygon>
+            </wp:wrapTight>
+            <wp:docPr id="340251870" name="Imagem 2" descr="Uma imagem com Tipo de letra, Gráficos, logótipo, design&#10;&#10;Os conteúdos gerados por IA poderão estar incorretos."/>
+            <wp:cNvGraphicFramePr>
+              <a:graphicFrameLocks xmlns:a="http://schemas.openxmlformats.org/drawingml/2006/main" noChangeAspect="1"/>
+            </wp:cNvGraphicFramePr>
+            <a:graphic xmlns:a="http://schemas.openxmlformats.org/drawingml/2006/main">
+              <a:graphicData uri="http://schemas.openxmlformats.org/drawingml/2006/picture">
+                <pic:pic xmlns:pic="http://schemas.openxmlformats.org/drawingml/2006/picture">
+                  <pic:nvPicPr>
+                    <pic:cNvPr id="340251870" name="Imagem 2" descr="Uma imagem com Tipo de letra, Gráficos, logótipo, design&#10;&#10;Os conteúdos gerados por IA poderão estar incorretos."/>
+                    <pic:cNvPicPr>
+                      <a:picLocks noChangeAspect="1" noChangeArrowheads="1"/>
+                    </pic:cNvPicPr>
+                  </pic:nvPicPr>
+                  <pic:blipFill>
+                    <a:blip r:embed="rId5" cstate="print">
+                      <a:extLst>
+                        <a:ext uri="{28A0092B-C50C-407E-A947-70E740481C1C}">
+                          <a14:useLocalDpi xmlns:a14="http://schemas.microsoft.com/office/drawing/2010/main" val="0"/>
+                        </a:ext>
+                      </a:extLst>
+                    </a:blip>
+                    <a:srcRect/>
+                    <a:stretch>
+                      <a:fillRect/>
+                    </a:stretch>
+                  </pic:blipFill>
+                  <pic:spPr bwMode="auto">
+                    <a:xfrm>
+                      <a:off x="0" y="0"/>
+                      <a:ext cx="2828925" cy="1320165"/>
+                    </a:xfrm>
+                    <a:prstGeom prst="rect">
+                      <a:avLst/>
+                    </a:prstGeom>
+                    <a:noFill/>
+                    <a:ln>
+                      <a:noFill/>
+                    </a:ln>
+                  </pic:spPr>
+                </pic:pic>
+              </a:graphicData>
+            </a:graphic>
+            <wp14:sizeRelH relativeFrom="margin">
+              <wp14:pctWidth>0</wp14:pctWidth>
+            </wp14:sizeRelH>
+            <wp14:sizeRelV relativeFrom="margin">
+              <wp14:pctHeight>0</wp14:pctHeight>
+            </wp14:sizeRelV>
+          </wp:anchor>
+        </w:drawing>
+      </w:r>
+    </w:p>
+    <w:p>
+      <w:pPr>
         <w:rPr>
           <w:rFonts w:ascii="Arial" w:hAnsi="Arial" w:cs="Arial"/>
           <w:b/>
@@ -21,10 +104,10 @@
           <w:sz w:val="32"/>
           <w:szCs w:val="32"/>
         </w:rPr>
-        <w:t>Epicurius</w:t>
-      </w:r>
-      <w:proofErr w:type="spellEnd"/>
-      <w:r>
+      </w:pPr>
+    </w:p>
+    <w:p>
+      <w:pPr>
         <w:rPr>
           <w:rFonts w:ascii="Arial" w:hAnsi="Arial" w:cs="Arial"/>
           <w:b/>
@@ -32,9 +115,11 @@
           <w:sz w:val="32"/>
           <w:szCs w:val="32"/>
         </w:rPr>
-        <w:t xml:space="preserve"> </w:t>
-      </w:r>
-      <w:r>
+      </w:pPr>
+    </w:p>
+    <w:p>
+      <w:pPr>
+        <w:jc w:val="center"/>
         <w:rPr>
           <w:rFonts w:ascii="Arial" w:hAnsi="Arial" w:cs="Arial"/>
           <w:b/>
@@ -42,8 +127,8 @@
           <w:sz w:val="32"/>
           <w:szCs w:val="32"/>
         </w:rPr>
-        <w:t>–</w:t>
-      </w:r>
+      </w:pPr>
+      <w:proofErr w:type="spellStart"/>
       <w:r>
         <w:rPr>
           <w:rFonts w:ascii="Arial" w:hAnsi="Arial" w:cs="Arial"/>
@@ -52,8 +137,9 @@
           <w:sz w:val="32"/>
           <w:szCs w:val="32"/>
         </w:rPr>
-        <w:t xml:space="preserve"> </w:t>
-      </w:r>
+        <w:t>Epicurius</w:t>
+      </w:r>
+      <w:proofErr w:type="spellEnd"/>
       <w:r>
         <w:rPr>
           <w:rFonts w:ascii="Arial" w:hAnsi="Arial" w:cs="Arial"/>
@@ -62,11 +148,51 @@
           <w:sz w:val="32"/>
           <w:szCs w:val="32"/>
         </w:rPr>
+        <w:t xml:space="preserve"> </w:t>
+      </w:r>
+      <w:r>
+        <w:rPr>
+          <w:rFonts w:ascii="Arial" w:hAnsi="Arial" w:cs="Arial"/>
+          <w:b/>
+          <w:bCs/>
+          <w:sz w:val="32"/>
+          <w:szCs w:val="32"/>
+        </w:rPr>
+        <w:t>–</w:t>
+      </w:r>
+      <w:r>
+        <w:rPr>
+          <w:rFonts w:ascii="Arial" w:hAnsi="Arial" w:cs="Arial"/>
+          <w:b/>
+          <w:bCs/>
+          <w:sz w:val="32"/>
+          <w:szCs w:val="32"/>
+        </w:rPr>
+        <w:t xml:space="preserve"> </w:t>
+      </w:r>
+      <w:r>
+        <w:rPr>
+          <w:rFonts w:ascii="Arial" w:hAnsi="Arial" w:cs="Arial"/>
+          <w:b/>
+          <w:bCs/>
+          <w:sz w:val="32"/>
+          <w:szCs w:val="32"/>
+        </w:rPr>
         <w:t>Manual de Instruções</w:t>
       </w:r>
     </w:p>
     <w:p>
       <w:pPr>
+        <w:jc w:val="center"/>
+        <w:rPr>
+          <w:rFonts w:ascii="Arial" w:hAnsi="Arial" w:cs="Arial"/>
+          <w:b/>
+          <w:bCs/>
+        </w:rPr>
+      </w:pPr>
+    </w:p>
+    <w:p>
+      <w:pPr>
         <w:spacing w:line="276" w:lineRule="auto"/>
         <w:rPr>
           <w:rFonts w:ascii="Arial" w:hAnsi="Arial" w:cs="Arial"/>
@@ -82,7 +208,7 @@
         </w:rPr>
         <w:t xml:space="preserve">O repositório do projeto encontra-se aqui: </w:t>
       </w:r>
-      <w:hyperlink r:id="rId5" w:history="1">
+      <w:hyperlink r:id="rId6" w:history="1">
         <w:r>
           <w:rPr>
             <w:rStyle w:val="Hiperligao"/>
@@ -93,9 +219,361 @@
           <w:t>https://github.com/vascosta/epicurius</w:t>
         </w:r>
       </w:hyperlink>
+      <w:r>
+        <w:rPr>
+          <w:rFonts w:ascii="Arial" w:hAnsi="Arial" w:cs="Arial"/>
+          <w:sz w:val="22"/>
+          <w:szCs w:val="22"/>
+        </w:rPr>
+        <w:t xml:space="preserve"> e está organizado da seguinte maneira:</w:t>
+      </w:r>
     </w:p>
     <w:p>
       <w:pPr>
+        <w:numPr>
+          <w:ilvl w:val="0"/>
+          <w:numId w:val="3"/>
+        </w:numPr>
+        <w:spacing w:line="276" w:lineRule="auto"/>
+        <w:rPr>
+          <w:rFonts w:ascii="Arial" w:hAnsi="Arial" w:cs="Arial"/>
+          <w:sz w:val="22"/>
+          <w:szCs w:val="22"/>
+        </w:rPr>
+      </w:pPr>
+      <w:r>
+        <w:rPr>
+          <w:rFonts w:ascii="Arial" w:hAnsi="Arial" w:cs="Arial"/>
+          <w:b/>
+          <w:bCs/>
+          <w:sz w:val="22"/>
+          <w:szCs w:val="22"/>
+        </w:rPr>
+        <w:t xml:space="preserve">Diretoria </w:t>
+      </w:r>
+      <w:r>
+        <w:rPr>
+          <w:rFonts w:ascii="Arial" w:hAnsi="Arial" w:cs="Arial"/>
+          <w:b/>
+          <w:bCs/>
+          <w:sz w:val="22"/>
+          <w:szCs w:val="22"/>
+        </w:rPr>
+        <w:t>App</w:t>
+      </w:r>
+      <w:r>
+        <w:rPr>
+          <w:rFonts w:ascii="Arial" w:hAnsi="Arial" w:cs="Arial"/>
+          <w:sz w:val="22"/>
+          <w:szCs w:val="22"/>
+        </w:rPr>
+        <w:t xml:space="preserve"> – Contém o código-fonte da aplicação Android (</w:t>
+      </w:r>
+      <w:proofErr w:type="spellStart"/>
+      <w:r>
+        <w:rPr>
+          <w:rFonts w:ascii="Arial" w:hAnsi="Arial" w:cs="Arial"/>
+          <w:b/>
+          <w:bCs/>
+          <w:sz w:val="22"/>
+          <w:szCs w:val="22"/>
+        </w:rPr>
+        <w:t>frontend</w:t>
+      </w:r>
+      <w:proofErr w:type="spellEnd"/>
+      <w:r>
+        <w:rPr>
+          <w:rFonts w:ascii="Arial" w:hAnsi="Arial" w:cs="Arial"/>
+          <w:sz w:val="22"/>
+          <w:szCs w:val="22"/>
+        </w:rPr>
+        <w:t>).</w:t>
+      </w:r>
+    </w:p>
+    <w:p>
+      <w:pPr>
+        <w:numPr>
+          <w:ilvl w:val="0"/>
+          <w:numId w:val="3"/>
+        </w:numPr>
+        <w:spacing w:line="276" w:lineRule="auto"/>
+        <w:rPr>
+          <w:rFonts w:ascii="Arial" w:hAnsi="Arial" w:cs="Arial"/>
+          <w:sz w:val="22"/>
+          <w:szCs w:val="22"/>
+        </w:rPr>
+      </w:pPr>
+      <w:r>
+        <w:rPr>
+          <w:rFonts w:ascii="Arial" w:hAnsi="Arial" w:cs="Arial"/>
+          <w:b/>
+          <w:bCs/>
+          <w:sz w:val="22"/>
+          <w:szCs w:val="22"/>
+        </w:rPr>
+        <w:t xml:space="preserve">Diretoria </w:t>
+      </w:r>
+      <w:r>
+        <w:rPr>
+          <w:rFonts w:ascii="Arial" w:hAnsi="Arial" w:cs="Arial"/>
+          <w:b/>
+          <w:bCs/>
+          <w:sz w:val="22"/>
+          <w:szCs w:val="22"/>
+        </w:rPr>
+        <w:t>Demo</w:t>
+      </w:r>
+      <w:r>
+        <w:rPr>
+          <w:rFonts w:ascii="Arial" w:hAnsi="Arial" w:cs="Arial"/>
+          <w:sz w:val="22"/>
+          <w:szCs w:val="22"/>
+        </w:rPr>
+        <w:t xml:space="preserve"> – Inclui o ficheiro </w:t>
+      </w:r>
+      <w:r>
+        <w:rPr>
+          <w:rFonts w:ascii="Arial" w:hAnsi="Arial" w:cs="Arial"/>
+          <w:b/>
+          <w:bCs/>
+          <w:sz w:val="22"/>
+          <w:szCs w:val="22"/>
+        </w:rPr>
+        <w:t>APK</w:t>
+      </w:r>
+      <w:r>
+        <w:rPr>
+          <w:rFonts w:ascii="Arial" w:hAnsi="Arial" w:cs="Arial"/>
+          <w:sz w:val="22"/>
+          <w:szCs w:val="22"/>
+        </w:rPr>
+        <w:t xml:space="preserve"> da versão </w:t>
+      </w:r>
+      <w:r>
+        <w:rPr>
+          <w:rFonts w:ascii="Arial" w:hAnsi="Arial" w:cs="Arial"/>
+          <w:b/>
+          <w:bCs/>
+          <w:sz w:val="22"/>
+          <w:szCs w:val="22"/>
+        </w:rPr>
+        <w:t>beta</w:t>
+      </w:r>
+      <w:r>
+        <w:rPr>
+          <w:rFonts w:ascii="Arial" w:hAnsi="Arial" w:cs="Arial"/>
+          <w:sz w:val="22"/>
+          <w:szCs w:val="22"/>
+        </w:rPr>
+        <w:t xml:space="preserve"> da aplicação e o ficheiro</w:t>
+      </w:r>
+      <w:r>
+        <w:rPr>
+          <w:rFonts w:ascii="Arial" w:hAnsi="Arial" w:cs="Arial"/>
+          <w:sz w:val="22"/>
+          <w:szCs w:val="22"/>
+        </w:rPr>
+        <w:t xml:space="preserve"> </w:t>
+      </w:r>
+      <w:r>
+        <w:rPr>
+          <w:rFonts w:ascii="Arial" w:hAnsi="Arial" w:cs="Arial"/>
+          <w:sz w:val="22"/>
+          <w:szCs w:val="22"/>
+        </w:rPr>
+        <w:t xml:space="preserve">do </w:t>
+      </w:r>
+      <w:r>
+        <w:rPr>
+          <w:rFonts w:ascii="Arial" w:hAnsi="Arial" w:cs="Arial"/>
+          <w:b/>
+          <w:bCs/>
+          <w:sz w:val="22"/>
+          <w:szCs w:val="22"/>
+        </w:rPr>
+        <w:t>servidor</w:t>
+      </w:r>
+      <w:r>
+        <w:rPr>
+          <w:rFonts w:ascii="Arial" w:hAnsi="Arial" w:cs="Arial"/>
+          <w:sz w:val="22"/>
+          <w:szCs w:val="22"/>
+        </w:rPr>
+        <w:t>.</w:t>
+      </w:r>
+    </w:p>
+    <w:p>
+      <w:pPr>
+        <w:numPr>
+          <w:ilvl w:val="0"/>
+          <w:numId w:val="3"/>
+        </w:numPr>
+        <w:spacing w:line="276" w:lineRule="auto"/>
+        <w:rPr>
+          <w:rFonts w:ascii="Arial" w:hAnsi="Arial" w:cs="Arial"/>
+          <w:sz w:val="22"/>
+          <w:szCs w:val="22"/>
+        </w:rPr>
+      </w:pPr>
+      <w:r>
+        <w:rPr>
+          <w:rFonts w:ascii="Arial" w:hAnsi="Arial" w:cs="Arial"/>
+          <w:b/>
+          <w:bCs/>
+          <w:sz w:val="22"/>
+          <w:szCs w:val="22"/>
+        </w:rPr>
+        <w:t xml:space="preserve">Diretoria </w:t>
+      </w:r>
+      <w:proofErr w:type="spellStart"/>
+      <w:r>
+        <w:rPr>
+          <w:rFonts w:ascii="Arial" w:hAnsi="Arial" w:cs="Arial"/>
+          <w:b/>
+          <w:bCs/>
+          <w:sz w:val="22"/>
+          <w:szCs w:val="22"/>
+        </w:rPr>
+        <w:t>Docs</w:t>
+      </w:r>
+      <w:proofErr w:type="spellEnd"/>
+      <w:r>
+        <w:rPr>
+          <w:rFonts w:ascii="Arial" w:hAnsi="Arial" w:cs="Arial"/>
+          <w:sz w:val="22"/>
+          <w:szCs w:val="22"/>
+        </w:rPr>
+        <w:t xml:space="preserve"> – Contém </w:t>
+      </w:r>
+      <w:r>
+        <w:rPr>
+          <w:rFonts w:ascii="Arial" w:hAnsi="Arial" w:cs="Arial"/>
+          <w:b/>
+          <w:bCs/>
+          <w:sz w:val="22"/>
+          <w:szCs w:val="22"/>
+        </w:rPr>
+        <w:t>imagens</w:t>
+      </w:r>
+      <w:r>
+        <w:rPr>
+          <w:rFonts w:ascii="Arial" w:hAnsi="Arial" w:cs="Arial"/>
+          <w:sz w:val="22"/>
+          <w:szCs w:val="22"/>
+        </w:rPr>
+        <w:t xml:space="preserve"> e </w:t>
+      </w:r>
+      <w:r>
+        <w:rPr>
+          <w:rFonts w:ascii="Arial" w:hAnsi="Arial" w:cs="Arial"/>
+          <w:b/>
+          <w:bCs/>
+          <w:sz w:val="22"/>
+          <w:szCs w:val="22"/>
+        </w:rPr>
+        <w:t>documentação</w:t>
+      </w:r>
+      <w:r>
+        <w:rPr>
+          <w:rFonts w:ascii="Arial" w:hAnsi="Arial" w:cs="Arial"/>
+          <w:sz w:val="22"/>
+          <w:szCs w:val="22"/>
+        </w:rPr>
+        <w:t xml:space="preserve"> relevantes para a compreensão da aplicação.</w:t>
+      </w:r>
+    </w:p>
+    <w:p>
+      <w:pPr>
+        <w:numPr>
+          <w:ilvl w:val="0"/>
+          <w:numId w:val="3"/>
+        </w:numPr>
+        <w:spacing w:line="276" w:lineRule="auto"/>
+        <w:rPr>
+          <w:rFonts w:ascii="Arial" w:hAnsi="Arial" w:cs="Arial"/>
+          <w:sz w:val="22"/>
+          <w:szCs w:val="22"/>
+        </w:rPr>
+      </w:pPr>
+      <w:r>
+        <w:rPr>
+          <w:rFonts w:ascii="Arial" w:hAnsi="Arial" w:cs="Arial"/>
+          <w:b/>
+          <w:bCs/>
+          <w:sz w:val="22"/>
+          <w:szCs w:val="22"/>
+        </w:rPr>
+        <w:t xml:space="preserve">Diretoria </w:t>
+      </w:r>
+      <w:r>
+        <w:rPr>
+          <w:rFonts w:ascii="Arial" w:hAnsi="Arial" w:cs="Arial"/>
+          <w:b/>
+          <w:bCs/>
+          <w:sz w:val="22"/>
+          <w:szCs w:val="22"/>
+        </w:rPr>
+        <w:t>Server</w:t>
+      </w:r>
+      <w:r>
+        <w:rPr>
+          <w:rFonts w:ascii="Arial" w:hAnsi="Arial" w:cs="Arial"/>
+          <w:sz w:val="22"/>
+          <w:szCs w:val="22"/>
+        </w:rPr>
+        <w:t xml:space="preserve"> – Contém o código do </w:t>
+      </w:r>
+      <w:proofErr w:type="spellStart"/>
+      <w:r>
+        <w:rPr>
+          <w:rFonts w:ascii="Arial" w:hAnsi="Arial" w:cs="Arial"/>
+          <w:b/>
+          <w:bCs/>
+          <w:sz w:val="22"/>
+          <w:szCs w:val="22"/>
+        </w:rPr>
+        <w:t>backend</w:t>
+      </w:r>
+      <w:proofErr w:type="spellEnd"/>
+      <w:r>
+        <w:rPr>
+          <w:rFonts w:ascii="Arial" w:hAnsi="Arial" w:cs="Arial"/>
+          <w:sz w:val="22"/>
+          <w:szCs w:val="22"/>
+        </w:rPr>
+        <w:t xml:space="preserve"> da aplicação (</w:t>
+      </w:r>
+      <w:r>
+        <w:rPr>
+          <w:rFonts w:ascii="Arial" w:hAnsi="Arial" w:cs="Arial"/>
+          <w:b/>
+          <w:bCs/>
+          <w:sz w:val="22"/>
+          <w:szCs w:val="22"/>
+        </w:rPr>
+        <w:t>lado do servidor</w:t>
+      </w:r>
+      <w:r>
+        <w:rPr>
+          <w:rFonts w:ascii="Arial" w:hAnsi="Arial" w:cs="Arial"/>
+          <w:sz w:val="22"/>
+          <w:szCs w:val="22"/>
+        </w:rPr>
+        <w:t>).</w:t>
+      </w:r>
+    </w:p>
+    <w:p>
+      <w:pPr>
+        <w:spacing w:line="276" w:lineRule="auto"/>
+        <w:rPr>
+          <w:rFonts w:ascii="Arial" w:hAnsi="Arial" w:cs="Arial"/>
+          <w:sz w:val="28"/>
+          <w:szCs w:val="28"/>
+        </w:rPr>
+      </w:pPr>
+    </w:p>
+    <w:p>
+      <w:pPr>
         <w:spacing w:line="276" w:lineRule="auto"/>
         <w:rPr>
           <w:rFonts w:ascii="Arial" w:hAnsi="Arial" w:cs="Arial"/>
@@ -172,15 +650,7 @@
           <w:sz w:val="22"/>
           <w:szCs w:val="22"/>
         </w:rPr>
-        <w:t xml:space="preserve">consola aberta na diretoria </w:t>
-      </w:r>
-      <w:r>
-        <w:rPr>
-          <w:rFonts w:ascii="Arial" w:hAnsi="Arial" w:cs="Arial"/>
-          <w:sz w:val="22"/>
-          <w:szCs w:val="22"/>
-        </w:rPr>
-        <w:t>“</w:t>
+        <w:t>consola aberta na diretoria “</w:t>
       </w:r>
       <w:r>
         <w:rPr>
@@ -198,15 +668,7 @@
           <w:sz w:val="22"/>
           <w:szCs w:val="22"/>
         </w:rPr>
-        <w:t>”</w:t>
-      </w:r>
-      <w:r>
-        <w:rPr>
-          <w:rFonts w:ascii="Arial" w:hAnsi="Arial" w:cs="Arial"/>
-          <w:sz w:val="22"/>
-          <w:szCs w:val="22"/>
-        </w:rPr>
-        <w:t>:</w:t>
+        <w:t>”:</w:t>
       </w:r>
     </w:p>
     <w:p>
@@ -558,15 +1020,7 @@
           <w:sz w:val="22"/>
           <w:szCs w:val="22"/>
         </w:rPr>
-        <w:t xml:space="preserve">a </w:t>
-      </w:r>
-      <w:r>
-        <w:rPr>
-          <w:rFonts w:ascii="Arial" w:hAnsi="Arial" w:cs="Arial"/>
-          <w:sz w:val="22"/>
-          <w:szCs w:val="22"/>
-        </w:rPr>
-        <w:t xml:space="preserve">demonstrar os </w:t>
+        <w:t xml:space="preserve">a demonstrar os </w:t>
       </w:r>
       <w:proofErr w:type="spellStart"/>
       <w:r>
@@ -586,15 +1040,7 @@
           <w:sz w:val="22"/>
           <w:szCs w:val="22"/>
         </w:rPr>
-        <w:t xml:space="preserve"> já criados</w:t>
-      </w:r>
-      <w:r>
-        <w:rPr>
-          <w:rFonts w:ascii="Arial" w:hAnsi="Arial" w:cs="Arial"/>
-          <w:sz w:val="22"/>
-          <w:szCs w:val="22"/>
-        </w:rPr>
-        <w:t xml:space="preserve"> foi</w:t>
+        <w:t xml:space="preserve"> já criados foi</w:t>
       </w:r>
       <w:r>
         <w:rPr>
@@ -657,6 +1103,119 @@
           <w:szCs w:val="22"/>
         </w:rPr>
         <w:t>.</w:t>
+      </w:r>
+    </w:p>
+    <w:p>
+      <w:pPr>
+        <w:spacing w:line="276" w:lineRule="auto"/>
+        <w:rPr>
+          <w:rFonts w:ascii="Arial" w:hAnsi="Arial" w:cs="Arial"/>
+          <w:sz w:val="22"/>
+          <w:szCs w:val="22"/>
+        </w:rPr>
+      </w:pPr>
+    </w:p>
+    <w:p>
+      <w:pPr>
+        <w:spacing w:line="276" w:lineRule="auto"/>
+        <w:rPr>
+          <w:rFonts w:ascii="Arial" w:hAnsi="Arial" w:cs="Arial"/>
+          <w:sz w:val="22"/>
+          <w:szCs w:val="22"/>
+        </w:rPr>
+      </w:pPr>
+    </w:p>
+    <w:p>
+      <w:pPr>
+        <w:spacing w:line="276" w:lineRule="auto"/>
+        <w:rPr>
+          <w:rFonts w:ascii="Arial" w:hAnsi="Arial" w:cs="Arial"/>
+          <w:sz w:val="22"/>
+          <w:szCs w:val="22"/>
+        </w:rPr>
+      </w:pPr>
+    </w:p>
+    <w:p>
+      <w:pPr>
+        <w:spacing w:line="276" w:lineRule="auto"/>
+        <w:rPr>
+          <w:rFonts w:ascii="Arial" w:hAnsi="Arial" w:cs="Arial"/>
+          <w:sz w:val="22"/>
+          <w:szCs w:val="22"/>
+        </w:rPr>
+      </w:pPr>
+    </w:p>
+    <w:p>
+      <w:pPr>
+        <w:spacing w:line="276" w:lineRule="auto"/>
+        <w:jc w:val="center"/>
+        <w:rPr>
+          <w:rFonts w:ascii="Arial" w:hAnsi="Arial" w:cs="Arial"/>
+          <w:sz w:val="22"/>
+          <w:szCs w:val="22"/>
+        </w:rPr>
+      </w:pPr>
+      <w:r>
+        <w:rPr>
+          <w:rFonts w:ascii="Arial" w:hAnsi="Arial" w:cs="Arial"/>
+          <w:sz w:val="22"/>
+          <w:szCs w:val="22"/>
+        </w:rPr>
+        <w:t xml:space="preserve">Manual de Instruções </w:t>
+      </w:r>
+      <w:r>
+        <w:rPr>
+          <w:rFonts w:ascii="Arial" w:hAnsi="Arial" w:cs="Arial"/>
+          <w:sz w:val="22"/>
+          <w:szCs w:val="22"/>
+        </w:rPr>
+        <w:t>no âmbito de Projeto e Seminário</w:t>
+      </w:r>
+      <w:r>
+        <w:rPr>
+          <w:rFonts w:ascii="Arial" w:hAnsi="Arial" w:cs="Arial"/>
+          <w:sz w:val="22"/>
+          <w:szCs w:val="22"/>
+        </w:rPr>
+        <w:t xml:space="preserve"> </w:t>
+      </w:r>
+      <w:r>
+        <w:rPr>
+          <w:rFonts w:ascii="Arial" w:hAnsi="Arial" w:cs="Arial"/>
+          <w:sz w:val="22"/>
+          <w:szCs w:val="22"/>
+        </w:rPr>
+        <w:t>da licenciatura em Engenharia Informática e de Computadores</w:t>
+      </w:r>
+    </w:p>
+    <w:p>
+      <w:pPr>
+        <w:spacing w:line="276" w:lineRule="auto"/>
+        <w:jc w:val="center"/>
+        <w:rPr>
+          <w:rFonts w:ascii="Arial" w:hAnsi="Arial" w:cs="Arial"/>
+          <w:sz w:val="22"/>
+          <w:szCs w:val="22"/>
+        </w:rPr>
+      </w:pPr>
+    </w:p>
+    <w:p>
+      <w:pPr>
+        <w:spacing w:line="276" w:lineRule="auto"/>
+        <w:jc w:val="center"/>
+        <w:rPr>
+          <w:rFonts w:ascii="Arial" w:hAnsi="Arial" w:cs="Arial"/>
+          <w:sz w:val="22"/>
+          <w:szCs w:val="22"/>
+        </w:rPr>
+      </w:pPr>
+      <w:r>
+        <w:rPr>
+          <w:rFonts w:ascii="Arial" w:hAnsi="Arial" w:cs="Arial"/>
+          <w:sz w:val="22"/>
+          <w:szCs w:val="22"/>
+        </w:rPr>
+        <w:t>Junho 2025</w:t>
       </w:r>
     </w:p>
     <w:sectPr>
@@ -758,6 +1317,155 @@
     </w:lvl>
   </w:abstractNum>
   <w:abstractNum w:abstractNumId="1" w15:restartNumberingAfterBreak="0">
+    <w:nsid w:val="44C75137"/>
+    <w:multiLevelType w:val="multilevel"/>
+    <w:tmpl w:val="002CE558"/>
+    <w:lvl w:ilvl="0">
+      <w:start w:val="1"/>
+      <w:numFmt w:val="bullet"/>
+      <w:lvlText w:val=""/>
+      <w:lvlJc w:val="left"/>
+      <w:pPr>
+        <w:tabs>
+          <w:tab w:val="num" w:pos="720"/>
+        </w:tabs>
+        <w:ind w:left="720" w:hanging="360"/>
+      </w:pPr>
+      <w:rPr>
+        <w:rFonts w:ascii="Symbol" w:hAnsi="Symbol" w:hint="default"/>
+        <w:sz w:val="20"/>
+      </w:rPr>
+    </w:lvl>
+    <w:lvl w:ilvl="1" w:tentative="1">
+      <w:start w:val="1"/>
+      <w:numFmt w:val="bullet"/>
+      <w:lvlText w:val="o"/>
+      <w:lvlJc w:val="left"/>
+      <w:pPr>
+        <w:tabs>
+          <w:tab w:val="num" w:pos="1440"/>
+        </w:tabs>
+        <w:ind w:left="1440" w:hanging="360"/>
+      </w:pPr>
+      <w:rPr>
+        <w:rFonts w:ascii="Courier New" w:hAnsi="Courier New" w:hint="default"/>
+        <w:sz w:val="20"/>
+      </w:rPr>
+    </w:lvl>
+    <w:lvl w:ilvl="2" w:tentative="1">
+      <w:start w:val="1"/>
+      <w:numFmt w:val="bullet"/>
+      <w:lvlText w:val=""/>
+      <w:lvlJc w:val="left"/>
+      <w:pPr>
+        <w:tabs>
+          <w:tab w:val="num" w:pos="2160"/>
+        </w:tabs>
+        <w:ind w:left="2160" w:hanging="360"/>
+      </w:pPr>
+      <w:rPr>
+        <w:rFonts w:ascii="Wingdings" w:hAnsi="Wingdings" w:hint="default"/>
+        <w:sz w:val="20"/>
+      </w:rPr>
+    </w:lvl>
+    <w:lvl w:ilvl="3" w:tentative="1">
+      <w:start w:val="1"/>
+      <w:numFmt w:val="bullet"/>
+      <w:lvlText w:val=""/>
+      <w:lvlJc w:val="left"/>
+      <w:pPr>
+        <w:tabs>
+          <w:tab w:val="num" w:pos="2880"/>
+        </w:tabs>
+        <w:ind w:left="2880" w:hanging="360"/>
+      </w:pPr>
+      <w:rPr>
+        <w:rFonts w:ascii="Wingdings" w:hAnsi="Wingdings" w:hint="default"/>
+        <w:sz w:val="20"/>
+      </w:rPr>
+    </w:lvl>
+    <w:lvl w:ilvl="4" w:tentative="1">
+      <w:start w:val="1"/>
+      <w:numFmt w:val="bullet"/>
+      <w:lvlText w:val=""/>
+      <w:lvlJc w:val="left"/>
+      <w:pPr>
+        <w:tabs>
+          <w:tab w:val="num" w:pos="3600"/>
+        </w:tabs>
+        <w:ind w:left="3600" w:hanging="360"/>
+      </w:pPr>
+      <w:rPr>
+        <w:rFonts w:ascii="Wingdings" w:hAnsi="Wingdings" w:hint="default"/>
+        <w:sz w:val="20"/>
+      </w:rPr>
+    </w:lvl>
+    <w:lvl w:ilvl="5" w:tentative="1">
+      <w:start w:val="1"/>
+      <w:numFmt w:val="bullet"/>
+      <w:lvlText w:val=""/>
+      <w:lvlJc w:val="left"/>
+      <w:pPr>
+        <w:tabs>
+          <w:tab w:val="num" w:pos="4320"/>
+        </w:tabs>
+        <w:ind w:left="4320" w:hanging="360"/>
+      </w:pPr>
+      <w:rPr>
+        <w:rFonts w:ascii="Wingdings" w:hAnsi="Wingdings" w:hint="default"/>
+        <w:sz w:val="20"/>
+      </w:rPr>
+    </w:lvl>
+    <w:lvl w:ilvl="6" w:tentative="1">
+      <w:start w:val="1"/>
+      <w:numFmt w:val="bullet"/>
+      <w:lvlText w:val=""/>
+      <w:lvlJc w:val="left"/>
+      <w:pPr>
+        <w:tabs>
+          <w:tab w:val="num" w:pos="5040"/>
+        </w:tabs>
+        <w:ind w:left="5040" w:hanging="360"/>
+      </w:pPr>
+      <w:rPr>
+        <w:rFonts w:ascii="Wingdings" w:hAnsi="Wingdings" w:hint="default"/>
+        <w:sz w:val="20"/>
+      </w:rPr>
+    </w:lvl>
+    <w:lvl w:ilvl="7" w:tentative="1">
+      <w:start w:val="1"/>
+      <w:numFmt w:val="bullet"/>
+      <w:lvlText w:val=""/>
+      <w:lvlJc w:val="left"/>
+      <w:pPr>
+        <w:tabs>
+          <w:tab w:val="num" w:pos="5760"/>
+        </w:tabs>
+        <w:ind w:left="5760" w:hanging="360"/>
+      </w:pPr>
+      <w:rPr>
+        <w:rFonts w:ascii="Wingdings" w:hAnsi="Wingdings" w:hint="default"/>
+        <w:sz w:val="20"/>
+      </w:rPr>
+    </w:lvl>
+    <w:lvl w:ilvl="8" w:tentative="1">
+      <w:start w:val="1"/>
+      <w:numFmt w:val="bullet"/>
+      <w:lvlText w:val=""/>
+      <w:lvlJc w:val="left"/>
+      <w:pPr>
+        <w:tabs>
+          <w:tab w:val="num" w:pos="6480"/>
+        </w:tabs>
+        <w:ind w:left="6480" w:hanging="360"/>
+      </w:pPr>
+      <w:rPr>
+        <w:rFonts w:ascii="Wingdings" w:hAnsi="Wingdings" w:hint="default"/>
+        <w:sz w:val="20"/>
+      </w:rPr>
+    </w:lvl>
+  </w:abstractNum>
+  <w:abstractNum w:abstractNumId="2" w15:restartNumberingAfterBreak="0">
     <w:nsid w:val="57F80896"/>
     <w:multiLevelType w:val="hybridMultilevel"/>
     <w:tmpl w:val="8892C038"/>
@@ -847,6 +1555,9 @@
     <w:abstractNumId w:val="0"/>
   </w:num>
   <w:num w:numId="2" w16cid:durableId="1291742640">
+    <w:abstractNumId w:val="2"/>
+  </w:num>
+  <w:num w:numId="3" w16cid:durableId="308554605">
     <w:abstractNumId w:val="1"/>
   </w:num>
 </w:numbering>
@@ -1455,7 +2166,6 @@
   <w:style w:type="character" w:default="1" w:styleId="Tipodeletrapredefinidodopargrafo">
     <w:name w:val="Default Paragraph Font"/>
     <w:uiPriority w:val="1"/>
-    <w:semiHidden/>
     <w:unhideWhenUsed/>
   </w:style>
   <w:style w:type="table" w:default="1" w:styleId="Tabelanormal">

</xml_diff>

<commit_message>
*DOCS* *UPDATE* project info manual
</commit_message>
<xml_diff>
--- a/docs/infoG12.docx
+++ b/docs/infoG12.docx
@@ -587,7 +587,31 @@
           <w:sz w:val="22"/>
           <w:szCs w:val="22"/>
         </w:rPr>
-        <w:t xml:space="preserve">Nesta fase o </w:t>
+        <w:t>De modo a executar</w:t>
+      </w:r>
+      <w:r>
+        <w:rPr>
+          <w:rFonts w:ascii="Arial" w:hAnsi="Arial" w:cs="Arial"/>
+          <w:sz w:val="22"/>
+          <w:szCs w:val="22"/>
+        </w:rPr>
+        <w:t xml:space="preserve"> </w:t>
+      </w:r>
+      <w:r>
+        <w:rPr>
+          <w:rFonts w:ascii="Arial" w:hAnsi="Arial" w:cs="Arial"/>
+          <w:sz w:val="22"/>
+          <w:szCs w:val="22"/>
+        </w:rPr>
+        <w:t>o</w:t>
+      </w:r>
+      <w:r>
+        <w:rPr>
+          <w:rFonts w:ascii="Arial" w:hAnsi="Arial" w:cs="Arial"/>
+          <w:sz w:val="22"/>
+          <w:szCs w:val="22"/>
+        </w:rPr>
+        <w:t xml:space="preserve"> </w:t>
       </w:r>
       <w:r>
         <w:rPr>
@@ -605,27 +629,7 @@
           <w:sz w:val="22"/>
           <w:szCs w:val="22"/>
         </w:rPr>
-        <w:t xml:space="preserve"> não está </w:t>
-      </w:r>
-      <w:proofErr w:type="spellStart"/>
-      <w:r>
-        <w:rPr>
-          <w:rFonts w:ascii="Arial" w:hAnsi="Arial" w:cs="Arial"/>
-          <w:i/>
-          <w:iCs/>
-          <w:sz w:val="22"/>
-          <w:szCs w:val="22"/>
-        </w:rPr>
-        <w:t>deployed</w:t>
-      </w:r>
-      <w:proofErr w:type="spellEnd"/>
-      <w:r>
-        <w:rPr>
-          <w:rFonts w:ascii="Arial" w:hAnsi="Arial" w:cs="Arial"/>
-          <w:sz w:val="22"/>
-          <w:szCs w:val="22"/>
-        </w:rPr>
-        <w:t>, portanto terá de ser executado localmente, para tal:</w:t>
+        <w:t xml:space="preserve"> localmente:</w:t>
       </w:r>
     </w:p>
     <w:p>
@@ -833,29 +837,7 @@
           <w:sz w:val="22"/>
           <w:szCs w:val="22"/>
         </w:rPr>
-        <w:t xml:space="preserve"> = "</w:t>
-      </w:r>
-      <w:proofErr w:type="gramStart"/>
-      <w:r>
-        <w:rPr>
-          <w:rFonts w:ascii="Arial" w:hAnsi="Arial" w:cs="Arial"/>
-          <w:b/>
-          <w:bCs/>
-          <w:sz w:val="22"/>
-          <w:szCs w:val="22"/>
-        </w:rPr>
-        <w:t>jdbc:postgresql://localhost/dbo?user=postgres&amp;password=postgres</w:t>
-      </w:r>
-      <w:proofErr w:type="gramEnd"/>
-      <w:r>
-        <w:rPr>
-          <w:rFonts w:ascii="Arial" w:hAnsi="Arial" w:cs="Arial"/>
-          <w:b/>
-          <w:bCs/>
-          <w:sz w:val="22"/>
-          <w:szCs w:val="22"/>
-        </w:rPr>
-        <w:t>"</w:t>
+        <w:t xml:space="preserve"> = "jdbc:postgresql://localhost/dbo?user=postgres&amp;password=postgres"</w:t>
       </w:r>
     </w:p>
     <w:p>
@@ -878,93 +860,239 @@
           <w:sz w:val="22"/>
           <w:szCs w:val="22"/>
         </w:rPr>
-        <w:t xml:space="preserve">Executar o </w:t>
+        <w:t>Criar a variável de ambiente “</w:t>
+      </w:r>
+      <w:r>
+        <w:rPr>
+          <w:rFonts w:ascii="Arial" w:hAnsi="Arial" w:cs="Arial"/>
+          <w:b/>
+          <w:bCs/>
+          <w:sz w:val="22"/>
+          <w:szCs w:val="22"/>
+        </w:rPr>
+        <w:t>GOOGLE_CREDENTIALS</w:t>
+      </w:r>
+      <w:r>
+        <w:rPr>
+          <w:rFonts w:ascii="Arial" w:hAnsi="Arial" w:cs="Arial"/>
+          <w:sz w:val="22"/>
+          <w:szCs w:val="22"/>
+        </w:rPr>
+        <w:t>” com as credenciais para aceder aos serviços da Google</w:t>
+      </w:r>
+      <w:r>
+        <w:rPr>
+          <w:rFonts w:ascii="Arial" w:hAnsi="Arial" w:cs="Arial"/>
+          <w:sz w:val="22"/>
+          <w:szCs w:val="22"/>
+        </w:rPr>
+        <w:t xml:space="preserve"> (ver ficheiro </w:t>
       </w:r>
       <w:proofErr w:type="spellStart"/>
       <w:r>
         <w:rPr>
           <w:rFonts w:ascii="Arial" w:hAnsi="Arial" w:cs="Arial"/>
-          <w:sz w:val="22"/>
-          <w:szCs w:val="22"/>
-        </w:rPr>
-        <w:t>jar</w:t>
+          <w:b/>
+          <w:bCs/>
+          <w:sz w:val="22"/>
+          <w:szCs w:val="22"/>
+        </w:rPr>
+        <w:t>epicurius-</w:t>
+      </w:r>
+      <w:proofErr w:type="gramStart"/>
+      <w:r>
+        <w:rPr>
+          <w:rFonts w:ascii="Arial" w:hAnsi="Arial" w:cs="Arial"/>
+          <w:b/>
+          <w:bCs/>
+          <w:sz w:val="22"/>
+          <w:szCs w:val="22"/>
+        </w:rPr>
+        <w:t>credentials.json</w:t>
       </w:r>
       <w:proofErr w:type="spellEnd"/>
-      <w:r>
-        <w:rPr>
-          <w:rFonts w:ascii="Arial" w:hAnsi="Arial" w:cs="Arial"/>
-          <w:sz w:val="22"/>
-          <w:szCs w:val="22"/>
-        </w:rPr>
-        <w:t xml:space="preserve"> “</w:t>
-      </w:r>
-      <w:proofErr w:type="spellStart"/>
-      <w:r>
-        <w:rPr>
-          <w:rFonts w:ascii="Arial" w:hAnsi="Arial" w:cs="Arial"/>
-          <w:b/>
-          <w:bCs/>
-          <w:sz w:val="22"/>
-          <w:szCs w:val="22"/>
-        </w:rPr>
-        <w:t>epicurius</w:t>
-      </w:r>
-      <w:proofErr w:type="spellEnd"/>
-      <w:r>
-        <w:rPr>
-          <w:rFonts w:ascii="Arial" w:hAnsi="Arial" w:cs="Arial"/>
-          <w:b/>
-          <w:bCs/>
-          <w:sz w:val="22"/>
-          <w:szCs w:val="22"/>
-        </w:rPr>
-        <w:t>-server</w:t>
-      </w:r>
-      <w:r>
-        <w:rPr>
-          <w:rFonts w:ascii="Arial" w:hAnsi="Arial" w:cs="Arial"/>
-          <w:sz w:val="22"/>
-          <w:szCs w:val="22"/>
-        </w:rPr>
-        <w:t>” (java -</w:t>
-      </w:r>
-      <w:proofErr w:type="spellStart"/>
-      <w:r>
-        <w:rPr>
-          <w:rFonts w:ascii="Arial" w:hAnsi="Arial" w:cs="Arial"/>
-          <w:sz w:val="22"/>
-          <w:szCs w:val="22"/>
-        </w:rPr>
-        <w:t>jar</w:t>
-      </w:r>
-      <w:proofErr w:type="spellEnd"/>
-      <w:r>
-        <w:rPr>
-          <w:rFonts w:ascii="Arial" w:hAnsi="Arial" w:cs="Arial"/>
-          <w:sz w:val="22"/>
-          <w:szCs w:val="22"/>
-        </w:rPr>
-        <w:t xml:space="preserve"> epicurius-</w:t>
-      </w:r>
-      <w:r>
-        <w:rPr>
-          <w:rFonts w:ascii="Arial" w:hAnsi="Arial" w:cs="Arial"/>
-          <w:sz w:val="22"/>
-          <w:szCs w:val="22"/>
-        </w:rPr>
-        <w:t>server</w:t>
-      </w:r>
-      <w:r>
-        <w:rPr>
-          <w:rFonts w:ascii="Arial" w:hAnsi="Arial" w:cs="Arial"/>
-          <w:sz w:val="22"/>
-          <w:szCs w:val="22"/>
-        </w:rPr>
-        <w:t>.jar)</w:t>
+      <w:proofErr w:type="gramEnd"/>
+      <w:r>
+        <w:rPr>
+          <w:rFonts w:ascii="Arial" w:hAnsi="Arial" w:cs="Arial"/>
+          <w:sz w:val="22"/>
+          <w:szCs w:val="22"/>
+        </w:rPr>
+        <w:t>)</w:t>
       </w:r>
     </w:p>
     <w:p>
       <w:pPr>
+        <w:pStyle w:val="PargrafodaLista"/>
+        <w:numPr>
+          <w:ilvl w:val="0"/>
+          <w:numId w:val="2"/>
+        </w:numPr>
+        <w:spacing w:line="360" w:lineRule="auto"/>
+        <w:rPr>
+          <w:rFonts w:ascii="Arial" w:hAnsi="Arial" w:cs="Arial"/>
+          <w:sz w:val="22"/>
+          <w:szCs w:val="22"/>
+        </w:rPr>
+      </w:pPr>
+      <w:r>
+        <w:rPr>
+          <w:rFonts w:ascii="Arial" w:hAnsi="Arial" w:cs="Arial"/>
+          <w:sz w:val="22"/>
+          <w:szCs w:val="22"/>
+        </w:rPr>
+        <w:t>Criar a variável de ambiente “</w:t>
+      </w:r>
+      <w:r>
+        <w:rPr>
+          <w:rFonts w:ascii="Arial" w:hAnsi="Arial" w:cs="Arial"/>
+          <w:b/>
+          <w:bCs/>
+          <w:sz w:val="22"/>
+          <w:szCs w:val="22"/>
+        </w:rPr>
+        <w:t>SPOONACULAR_API_KEY</w:t>
+      </w:r>
+      <w:r>
+        <w:rPr>
+          <w:rFonts w:ascii="Arial" w:hAnsi="Arial" w:cs="Arial"/>
+          <w:sz w:val="22"/>
+          <w:szCs w:val="22"/>
+        </w:rPr>
+        <w:t>”</w:t>
+      </w:r>
+      <w:r>
+        <w:rPr>
+          <w:rFonts w:ascii="Arial" w:hAnsi="Arial" w:cs="Arial"/>
+          <w:sz w:val="22"/>
+          <w:szCs w:val="22"/>
+        </w:rPr>
+        <w:t xml:space="preserve"> (</w:t>
+      </w:r>
+      <w:r>
+        <w:rPr>
+          <w:rFonts w:ascii="Arial" w:hAnsi="Arial" w:cs="Arial"/>
+          <w:sz w:val="22"/>
+          <w:szCs w:val="22"/>
+        </w:rPr>
+        <w:t>488c0b0b462c4165a3c3c1c343e7906f</w:t>
+      </w:r>
+      <w:r>
+        <w:rPr>
+          <w:rFonts w:ascii="Arial" w:hAnsi="Arial" w:cs="Arial"/>
+          <w:sz w:val="22"/>
+          <w:szCs w:val="22"/>
+        </w:rPr>
+        <w:t>)</w:t>
+      </w:r>
+    </w:p>
+    <w:p>
+      <w:pPr>
+        <w:pStyle w:val="PargrafodaLista"/>
+        <w:numPr>
+          <w:ilvl w:val="0"/>
+          <w:numId w:val="2"/>
+        </w:numPr>
+        <w:spacing w:line="360" w:lineRule="auto"/>
+        <w:rPr>
+          <w:rFonts w:ascii="Arial" w:hAnsi="Arial" w:cs="Arial"/>
+          <w:sz w:val="22"/>
+          <w:szCs w:val="22"/>
+        </w:rPr>
+      </w:pPr>
+      <w:r>
+        <w:rPr>
+          <w:rFonts w:ascii="Arial" w:hAnsi="Arial" w:cs="Arial"/>
+          <w:sz w:val="22"/>
+          <w:szCs w:val="22"/>
+        </w:rPr>
+        <w:t xml:space="preserve">Executar o </w:t>
+      </w:r>
+      <w:proofErr w:type="spellStart"/>
+      <w:r>
+        <w:rPr>
+          <w:rFonts w:ascii="Arial" w:hAnsi="Arial" w:cs="Arial"/>
+          <w:sz w:val="22"/>
+          <w:szCs w:val="22"/>
+        </w:rPr>
+        <w:t>jar</w:t>
+      </w:r>
+      <w:proofErr w:type="spellEnd"/>
+      <w:r>
+        <w:rPr>
+          <w:rFonts w:ascii="Arial" w:hAnsi="Arial" w:cs="Arial"/>
+          <w:sz w:val="22"/>
+          <w:szCs w:val="22"/>
+        </w:rPr>
+        <w:t xml:space="preserve"> “</w:t>
+      </w:r>
+      <w:proofErr w:type="spellStart"/>
+      <w:r>
+        <w:rPr>
+          <w:rFonts w:ascii="Arial" w:hAnsi="Arial" w:cs="Arial"/>
+          <w:b/>
+          <w:bCs/>
+          <w:sz w:val="22"/>
+          <w:szCs w:val="22"/>
+        </w:rPr>
+        <w:t>epicurius</w:t>
+      </w:r>
+      <w:proofErr w:type="spellEnd"/>
+      <w:r>
+        <w:rPr>
+          <w:rFonts w:ascii="Arial" w:hAnsi="Arial" w:cs="Arial"/>
+          <w:b/>
+          <w:bCs/>
+          <w:sz w:val="22"/>
+          <w:szCs w:val="22"/>
+        </w:rPr>
+        <w:t>-server</w:t>
+      </w:r>
+      <w:r>
+        <w:rPr>
+          <w:rFonts w:ascii="Arial" w:hAnsi="Arial" w:cs="Arial"/>
+          <w:sz w:val="22"/>
+          <w:szCs w:val="22"/>
+        </w:rPr>
+        <w:t>” (java -</w:t>
+      </w:r>
+      <w:proofErr w:type="spellStart"/>
+      <w:r>
+        <w:rPr>
+          <w:rFonts w:ascii="Arial" w:hAnsi="Arial" w:cs="Arial"/>
+          <w:sz w:val="22"/>
+          <w:szCs w:val="22"/>
+        </w:rPr>
+        <w:t>jar</w:t>
+      </w:r>
+      <w:proofErr w:type="spellEnd"/>
+      <w:r>
+        <w:rPr>
+          <w:rFonts w:ascii="Arial" w:hAnsi="Arial" w:cs="Arial"/>
+          <w:sz w:val="22"/>
+          <w:szCs w:val="22"/>
+        </w:rPr>
+        <w:t xml:space="preserve"> epicurius-</w:t>
+      </w:r>
+      <w:r>
+        <w:rPr>
+          <w:rFonts w:ascii="Arial" w:hAnsi="Arial" w:cs="Arial"/>
+          <w:sz w:val="22"/>
+          <w:szCs w:val="22"/>
+        </w:rPr>
+        <w:t>server</w:t>
+      </w:r>
+      <w:r>
+        <w:rPr>
+          <w:rFonts w:ascii="Arial" w:hAnsi="Arial" w:cs="Arial"/>
+          <w:sz w:val="22"/>
+          <w:szCs w:val="22"/>
+        </w:rPr>
+        <w:t>.jar)</w:t>
+      </w:r>
+    </w:p>
+    <w:p>
+      <w:pPr>
         <w:spacing w:line="276" w:lineRule="auto"/>
         <w:rPr>
           <w:rFonts w:ascii="Arial" w:hAnsi="Arial" w:cs="Arial"/>
@@ -978,49 +1106,7 @@
           <w:sz w:val="22"/>
           <w:szCs w:val="22"/>
         </w:rPr>
-        <w:t xml:space="preserve">Nesta fase a </w:t>
-      </w:r>
-      <w:r>
-        <w:rPr>
-          <w:rFonts w:ascii="Arial" w:hAnsi="Arial" w:cs="Arial"/>
-          <w:b/>
-          <w:bCs/>
-          <w:sz w:val="22"/>
-          <w:szCs w:val="22"/>
-        </w:rPr>
-        <w:t>aplicação Android</w:t>
-      </w:r>
-      <w:r>
-        <w:rPr>
-          <w:rFonts w:ascii="Arial" w:hAnsi="Arial" w:cs="Arial"/>
-          <w:sz w:val="22"/>
-          <w:szCs w:val="22"/>
-        </w:rPr>
-        <w:t xml:space="preserve"> não está finalizada</w:t>
-      </w:r>
-      <w:r>
-        <w:rPr>
-          <w:rFonts w:ascii="Arial" w:hAnsi="Arial" w:cs="Arial"/>
-          <w:sz w:val="22"/>
-          <w:szCs w:val="22"/>
-        </w:rPr>
-        <w:t>. D</w:t>
-      </w:r>
-      <w:r>
-        <w:rPr>
-          <w:rFonts w:ascii="Arial" w:hAnsi="Arial" w:cs="Arial"/>
-          <w:sz w:val="22"/>
-          <w:szCs w:val="22"/>
-        </w:rPr>
-        <w:t xml:space="preserve">e maneira </w:t>
-      </w:r>
-      <w:r>
-        <w:rPr>
-          <w:rFonts w:ascii="Arial" w:hAnsi="Arial" w:cs="Arial"/>
-          <w:sz w:val="22"/>
-          <w:szCs w:val="22"/>
-        </w:rPr>
-        <w:t xml:space="preserve">a demonstrar os </w:t>
+        <w:t xml:space="preserve">De forma a executar a aplicação Android, pode usar o emulador e correr a </w:t>
       </w:r>
       <w:proofErr w:type="spellStart"/>
       <w:r>
@@ -1031,7 +1117,17 @@
           <w:sz w:val="22"/>
           <w:szCs w:val="22"/>
         </w:rPr>
-        <w:t>screens</w:t>
+        <w:t>a</w:t>
+      </w:r>
+      <w:r>
+        <w:rPr>
+          <w:rFonts w:ascii="Arial" w:hAnsi="Arial" w:cs="Arial"/>
+          <w:i/>
+          <w:iCs/>
+          <w:sz w:val="22"/>
+          <w:szCs w:val="22"/>
+        </w:rPr>
+        <w:t>ctivity</w:t>
       </w:r>
       <w:proofErr w:type="spellEnd"/>
       <w:r>
@@ -1040,15 +1136,27 @@
           <w:sz w:val="22"/>
           <w:szCs w:val="22"/>
         </w:rPr>
-        <w:t xml:space="preserve"> já criados foi</w:t>
-      </w:r>
-      <w:r>
-        <w:rPr>
-          <w:rFonts w:ascii="Arial" w:hAnsi="Arial" w:cs="Arial"/>
-          <w:sz w:val="22"/>
-          <w:szCs w:val="22"/>
-        </w:rPr>
-        <w:t xml:space="preserve"> gerado um </w:t>
+        <w:t xml:space="preserve"> “</w:t>
+      </w:r>
+      <w:proofErr w:type="spellStart"/>
+      <w:r>
+        <w:rPr>
+          <w:rFonts w:ascii="Arial" w:hAnsi="Arial" w:cs="Arial"/>
+          <w:b/>
+          <w:bCs/>
+          <w:sz w:val="22"/>
+          <w:szCs w:val="22"/>
+        </w:rPr>
+        <w:t>FeedActivity</w:t>
+      </w:r>
+      <w:proofErr w:type="spellEnd"/>
+      <w:r>
+        <w:rPr>
+          <w:rFonts w:ascii="Arial" w:hAnsi="Arial" w:cs="Arial"/>
+          <w:sz w:val="22"/>
+          <w:szCs w:val="22"/>
+        </w:rPr>
+        <w:t xml:space="preserve">” ou usar o </w:t>
       </w:r>
       <w:proofErr w:type="spellStart"/>
       <w:r>
@@ -1128,16 +1236,50 @@
     <w:p>
       <w:pPr>
         <w:spacing w:line="276" w:lineRule="auto"/>
-        <w:rPr>
-          <w:rFonts w:ascii="Arial" w:hAnsi="Arial" w:cs="Arial"/>
-          <w:sz w:val="22"/>
-          <w:szCs w:val="22"/>
-        </w:rPr>
-      </w:pPr>
+        <w:jc w:val="center"/>
+        <w:rPr>
+          <w:rFonts w:ascii="Arial" w:hAnsi="Arial" w:cs="Arial"/>
+          <w:sz w:val="22"/>
+          <w:szCs w:val="22"/>
+        </w:rPr>
+      </w:pPr>
+      <w:r>
+        <w:rPr>
+          <w:rFonts w:ascii="Arial" w:hAnsi="Arial" w:cs="Arial"/>
+          <w:sz w:val="22"/>
+          <w:szCs w:val="22"/>
+        </w:rPr>
+        <w:t xml:space="preserve">Manual de Instruções </w:t>
+      </w:r>
+      <w:r>
+        <w:rPr>
+          <w:rFonts w:ascii="Arial" w:hAnsi="Arial" w:cs="Arial"/>
+          <w:sz w:val="22"/>
+          <w:szCs w:val="22"/>
+        </w:rPr>
+        <w:t>no âmbito de Projeto e Seminário</w:t>
+      </w:r>
+      <w:r>
+        <w:rPr>
+          <w:rFonts w:ascii="Arial" w:hAnsi="Arial" w:cs="Arial"/>
+          <w:sz w:val="22"/>
+          <w:szCs w:val="22"/>
+        </w:rPr>
+        <w:t xml:space="preserve"> </w:t>
+      </w:r>
+      <w:r>
+        <w:rPr>
+          <w:rFonts w:ascii="Arial" w:hAnsi="Arial" w:cs="Arial"/>
+          <w:sz w:val="22"/>
+          <w:szCs w:val="22"/>
+        </w:rPr>
+        <w:t>da licenciatura em Engenharia Informática e de Computadores</w:t>
+      </w:r>
     </w:p>
     <w:p>
       <w:pPr>
         <w:spacing w:line="276" w:lineRule="auto"/>
+        <w:jc w:val="center"/>
         <w:rPr>
           <w:rFonts w:ascii="Arial" w:hAnsi="Arial" w:cs="Arial"/>
           <w:sz w:val="22"/>
@@ -1161,61 +1303,23 @@
           <w:sz w:val="22"/>
           <w:szCs w:val="22"/>
         </w:rPr>
-        <w:t xml:space="preserve">Manual de Instruções </w:t>
-      </w:r>
-      <w:r>
-        <w:rPr>
-          <w:rFonts w:ascii="Arial" w:hAnsi="Arial" w:cs="Arial"/>
-          <w:sz w:val="22"/>
-          <w:szCs w:val="22"/>
-        </w:rPr>
-        <w:t>no âmbito de Projeto e Seminário</w:t>
-      </w:r>
-      <w:r>
-        <w:rPr>
-          <w:rFonts w:ascii="Arial" w:hAnsi="Arial" w:cs="Arial"/>
-          <w:sz w:val="22"/>
-          <w:szCs w:val="22"/>
-        </w:rPr>
-        <w:t xml:space="preserve"> </w:t>
-      </w:r>
-      <w:r>
-        <w:rPr>
-          <w:rFonts w:ascii="Arial" w:hAnsi="Arial" w:cs="Arial"/>
-          <w:sz w:val="22"/>
-          <w:szCs w:val="22"/>
-        </w:rPr>
-        <w:t>da licenciatura em Engenharia Informática e de Computadores</w:t>
-      </w:r>
-    </w:p>
-    <w:p>
-      <w:pPr>
-        <w:spacing w:line="276" w:lineRule="auto"/>
-        <w:jc w:val="center"/>
-        <w:rPr>
-          <w:rFonts w:ascii="Arial" w:hAnsi="Arial" w:cs="Arial"/>
-          <w:sz w:val="22"/>
-          <w:szCs w:val="22"/>
-        </w:rPr>
-      </w:pPr>
-    </w:p>
-    <w:p>
-      <w:pPr>
-        <w:spacing w:line="276" w:lineRule="auto"/>
-        <w:jc w:val="center"/>
-        <w:rPr>
-          <w:rFonts w:ascii="Arial" w:hAnsi="Arial" w:cs="Arial"/>
-          <w:sz w:val="22"/>
-          <w:szCs w:val="22"/>
-        </w:rPr>
-      </w:pPr>
-      <w:r>
-        <w:rPr>
-          <w:rFonts w:ascii="Arial" w:hAnsi="Arial" w:cs="Arial"/>
-          <w:sz w:val="22"/>
-          <w:szCs w:val="22"/>
-        </w:rPr>
-        <w:t>Junho 2025</w:t>
+        <w:t>Ju</w:t>
+      </w:r>
+      <w:r>
+        <w:rPr>
+          <w:rFonts w:ascii="Arial" w:hAnsi="Arial" w:cs="Arial"/>
+          <w:sz w:val="22"/>
+          <w:szCs w:val="22"/>
+        </w:rPr>
+        <w:t>lho</w:t>
+      </w:r>
+      <w:r>
+        <w:rPr>
+          <w:rFonts w:ascii="Arial" w:hAnsi="Arial" w:cs="Arial"/>
+          <w:sz w:val="22"/>
+          <w:szCs w:val="22"/>
+        </w:rPr>
+        <w:t xml:space="preserve"> 2025</w:t>
       </w:r>
     </w:p>
     <w:sectPr>
@@ -2166,6 +2270,7 @@
   <w:style w:type="character" w:default="1" w:styleId="Tipodeletrapredefinidodopargrafo">
     <w:name w:val="Default Paragraph Font"/>
     <w:uiPriority w:val="1"/>
+    <w:semiHidden/>
     <w:unhideWhenUsed/>
   </w:style>
   <w:style w:type="table" w:default="1" w:styleId="Tabelanormal">

</xml_diff>